<commit_message>
feat(ml): honest time-based training, baselines and saved artifacts
Demand forecast: winsorized target, per-SKU lag/rolling features, a
time-based split (random splits leak rolling features), and two naive
baselines on the same test rows. MAE 21.48 / R^2 0.178 vs the best
baseline's 25.11 / 0.155; saves model + metrics to app/ml/artifacts and
regenerates the Vercel sample. Bot detection: multi-seed ROC-AUC/AP
(0.989 / 0.876) and saved artifacts. README and case study updated.

Co-Authored-By: Claude Sonnet 5.5 <noreply@anthropic.com>
</commit_message>
<xml_diff>
--- a/docs/case_study.docx
+++ b/docs/case_study.docx
@@ -1935,16 +1935,16 @@
         <w:t>Demand forecasting</w:t>
       </w:r>
       <w:r>
-        <w:t xml:space="preserve"> (gradient boosting) trains on the UCI Online Retail dataset (about 541k line items) to predict next-day units per SKU, which informs whether a product warrants pessimistic locking or can use OCC. Result: </w:t>
+        <w:t xml:space="preserve"> (gradient boosting) trains on the UCI Online Retail dataset (about 541k line items) to predict next-day units per SKU, which informs whether a product warrants pessimistic locking or can use OCC. It is evaluated honestly: daily quantities are winsorized at the 99.5th percentile (360 units), features are per-SKU lags and rolling means, and the split is time-based (train on the first 80% of the calendar, test on the last 20%) because a random split leaks rolling features across the boundary. Result: </w:t>
       </w:r>
       <w:r>
         <w:rPr>
           <w:b/>
         </w:rPr>
-        <w:t>MAE 21.84, R^2 0.082</w:t>
+        <w:t>MAE 21.48, R^2 0.178</w:t>
       </w:r>
       <w:r>
-        <w:t>. The low R^2 is a data-framing limit, not a bug: the dataset has no flash-sale events, about 51% of SKU-days have zero sales, and the same code scores R^2 0.941 on a synthetic control whose labels are a known formula. Coarsening the horizon to next-7-day or weekly roughly triples R^2. The synthetic figure is a pipeline sanity check and must not be quoted as forecasting accuracy.</w:t>
+        <w:t>, beating a trailing-28-day-mean baseline (MAE 25.11, R^2 0.155) and a "yesterday" baseline (MAE 33.12). The gain is modest, which is expected: the dataset has no flash-sale events and about 51% of SKU-days have zero sales. On a 7-day horizon a plain moving average (R^2 0.505) actually beat the model (0.272), so the model is shipped only for the next-day question. The same code scores R^2 0.941 on a synthetic control whose labels are a known formula; that figure is a pipeline sanity check and must not be quoted as forecasting accuracy.</w:t>
       </w:r>
     </w:p>
     <w:p>
@@ -1955,7 +1955,7 @@
         <w:t>Bot detection</w:t>
       </w:r>
       <w:r>
-        <w:t xml:space="preserve"> uses Isolation Forest, deliberately unsupervised because real bot labels are scarce. On a synthetic harness with known bots it caught 83 of 100 (83% recall and precision). On real checkout sessions it flags unusual sessions (very fast checkout, many accounts per device) and writes them to </w:t>
+        <w:t xml:space="preserve"> uses Isolation Forest, deliberately unsupervised because real bot labels are scarce. On a synthetic harness with known bots it caught 83 of 100 (83% recall and precision); ranked by score alone, ROC-AUC is 0.989 over five draws, so the cut at 10% contamination, not the model, costs the rest. On real checkout sessions it flags unusual sessions (very fast checkout, many accounts per device) and writes them to </w:t>
       </w:r>
       <w:r>
         <w:rPr>

</xml_diff>